<commit_message>
DVR: opdater ændringsoversigt til Maj-Britts Kontrakt-version
Afsnit 3.1 gengiver nu hendes indsættelser ordret, følgevirkningerne for
nummereringen og den ene tilføjelse. Nyt afsnit 3.9 om Bilag 09 og
afsnit 4 om sammenhængen mellem Kontrakt og bilag.

Co-Authored-By: Claude Fable 5.1 <noreply@anthropic.com>
Claude-Session: https://claude.ai/code/session_011976vgLmukizxh8qCBktF4
</commit_message>
<xml_diff>
--- a/Stjernekort/testdata/dvr/Ændringsoversigt - Option DVR online.docx
+++ b/Stjernekort/testdata/dvr/Ændringsoversigt - Option DVR online.docx
@@ -27,7 +27,7 @@
           <w:sz w:val="18"/>
           <w:szCs w:val="18"/>
         </w:rPr>
-        <w:t xml:space="preserve">Arbejdsnotat, 29. september 2026. Udarbejdet med Claude Code. Alle ændringer i Word-dokumenterne er indsat som sporede ændringer (forfatter "Claude"), så de kan accepteres eller afvises enkeltvis. Ændringer i de to Excel-ark er indsat direkte.</w:t>
+        <w:t xml:space="preserve">Arbejdsnotat, 30. september 2026. Udarbejdet med Claude Code. Alle ændringer i Word-dokumenterne er indsat som sporede ændringer (forfatter "Claude"), så de kan accepteres eller afvises enkeltvis. Ændringer i de to Excel-ark er indsat direkte.</w:t>
       </w:r>
     </w:p>
     <w:p>
@@ -133,7 +133,7 @@
           <w:sz w:val="18"/>
           <w:szCs w:val="18"/>
         </w:rPr>
-        <w:t xml:space="preserve">Kontrakten i repoet er versionen fra 23. september uden Maj-Britts sporede ændringer. Ændringerne her er derfor et samlet alternativ, der skal holdes op mod hendes version (se afsnit 4).</w:t>
+        <w:t xml:space="preserve">Kontrakten er Maj-Britts version med hendes sporede ændringer af 29. september. De øvrige bilag henviser til hendes punktnumre: 6.2 og 6.3 (Optionen) og 15.3 (vederlag).</w:t>
       </w:r>
     </w:p>
     <w:p>
@@ -1339,7 +1339,7 @@
           <w:sz w:val="18"/>
           <w:szCs w:val="18"/>
         </w:rPr>
-        <w:t xml:space="preserve">Overskriftsnumre er automatiske. Nyt punkt 6.2 rykker Bestillingsydelser til 6.3, og nyt punkt 15.8 rykker Betalingsbetingelser til 15.9. Indholdsfortegnelsen opdateres ved åbning i Word (højreklik, opdater felt).</w:t>
+        <w:t xml:space="preserve">Grundlaget er Maj-Britts version med sporede ændringer (forfatter "Maj-Britt Rose Böwadt"). Hendes indsættelser er gengivet nedenfor, så alle henvisninger i de øvrige bilag kan efterprøves. Oven på dem er tilføjet én sætning (forfatter "Claude"). Kontraktens interne krydshenvisninger er REF-felter og opdateres i Word med Ctrl+A og F9; indtil da viser de gamle numre (fx "punkt 6.2.2" og "punkt 15.3").</w:t>
       </w:r>
     </w:p>
     <w:tbl>
@@ -1458,7 +1458,7 @@
                 <w:sz w:val="18"/>
                 <w:szCs w:val="18"/>
               </w:rPr>
-              <w:t xml:space="preserve">Ny ordlyd</w:t>
+              <w:t xml:space="preserve">Ny ordlyd (Maj-Britt, medmindre andet er angivet)</w:t>
             </w:r>
           </w:p>
         </w:tc>
@@ -1556,7 +1556,7 @@
                 <w:sz w:val="17"/>
                 <w:szCs w:val="17"/>
               </w:rPr>
-              <w:t xml:space="preserve">Option: "Kundens ret, men ikke pligt, til at bestille udvikling og levering af DVR online som beskrevet i bilag 3A, afsnit 2.1, 2.3 og 3.5, til det i bilag 12 fastsatte vederlag og på Kontraktens vilkår i øvrigt, jf. punkt 6.2. Ved Optionen forstås tillige de ydelser, der er omfattet heraf."</w:t>
+              <w:t xml:space="preserve">Option: "En ret for Kunden til at købe yderligere bestemte ydelser, som beskrevet i bilag 3, til de i Kontrakten fastsatte priser og øvrige vilkår. En Option kan bestilles til levering samtidig med og som en del af Leverancen eller som en Selvstændig Opgave."</w:t>
             </w:r>
           </w:p>
         </w:tc>
@@ -1654,7 +1654,7 @@
                 <w:sz w:val="17"/>
                 <w:szCs w:val="17"/>
               </w:rPr>
-              <w:t xml:space="preserve">"Ændringer samt Optionen, som ikke afprøves som en del af Leverancen."</w:t>
+              <w:t xml:space="preserve">"Option eller ændringer, som ikke afprøves som en del af Leverancen."</w:t>
             </w:r>
           </w:p>
         </w:tc>
@@ -1688,7 +1688,7 @@
                 <w:sz w:val="17"/>
                 <w:szCs w:val="17"/>
               </w:rPr>
-              <w:t xml:space="preserve">Punkt 3.1, nyt afsnit efter første afsnit</w:t>
+              <w:t xml:space="preserve">Punkt 3.1, første afsnit</w:t>
             </w:r>
           </w:p>
         </w:tc>
@@ -1720,7 +1720,7 @@
                 <w:sz w:val="17"/>
                 <w:szCs w:val="17"/>
               </w:rPr>
-              <w:t xml:space="preserve">(ny)</w:t>
+              <w:t xml:space="preserve">"Leverandøren skal levere de ydelser, der er beskrevet i Leverancebeskrivelsen (bilag 3)."</w:t>
             </w:r>
           </w:p>
         </w:tc>
@@ -1752,7 +1752,7 @@
                 <w:sz w:val="17"/>
                 <w:szCs w:val="17"/>
               </w:rPr>
-              <w:t xml:space="preserve">"Såfremt Kunden udnytter Optionen, jf. punkt 6.2, skal Leverandøren tillige levere de ydelser, der er omfattet af Optionen."</w:t>
+              <w:t xml:space="preserve">"Leverandøren skal levere de ydelser, der er beskrevet i Leverancebeskrivelsen (bilag 3), herunder bestilte Optioner."</w:t>
             </w:r>
           </w:p>
         </w:tc>
@@ -1786,7 +1786,7 @@
                 <w:sz w:val="17"/>
                 <w:szCs w:val="17"/>
               </w:rPr>
-              <w:t xml:space="preserve">Punkt 5.3.1, nyt afsnit efter første afsnit</w:t>
+              <w:t xml:space="preserve">Punkt 3.1, fjerde afsnit</w:t>
             </w:r>
           </w:p>
         </w:tc>
@@ -1818,7 +1818,7 @@
                 <w:sz w:val="17"/>
                 <w:szCs w:val="17"/>
               </w:rPr>
-              <w:t xml:space="preserve">(ny)</w:t>
+              <w:t xml:space="preserve">"Såfremt Løsningsbeskrivelsen indeholder yderligere funktionalitet end nødvendigt til at opfylde Kravspecifikationen, skal Leverandøren levere dette ..."</w:t>
             </w:r>
           </w:p>
         </w:tc>
@@ -1850,7 +1850,7 @@
                 <w:sz w:val="17"/>
                 <w:szCs w:val="17"/>
               </w:rPr>
-              <w:t xml:space="preserve">"Såfremt Kunden senest ved afklaringsfasens afslutning har udnyttet Optionen, jf. punkt 6.2.1, indgår aktiviteter vedrørende Optionen ligeledes i afklaringsfasen."</w:t>
+              <w:t xml:space="preserve">Indskudt: "... og uden at dette udtrykkeligt er angivet at være en Option eller anden ændringsmulighed, der skal bestilles særskilt, ..."</w:t>
             </w:r>
           </w:p>
         </w:tc>
@@ -1884,7 +1884,7 @@
                 <w:sz w:val="17"/>
                 <w:szCs w:val="17"/>
               </w:rPr>
-              <w:t xml:space="preserve">Nyt punkt 6.2 Optionen (før Bestillingsydelser)</w:t>
+              <w:t xml:space="preserve">Punkt 5.3.1, første afsnit</w:t>
             </w:r>
           </w:p>
         </w:tc>
@@ -1916,7 +1916,7 @@
                 <w:sz w:val="17"/>
                 <w:szCs w:val="17"/>
               </w:rPr>
-              <w:t xml:space="preserve">(ny)</w:t>
+              <w:t xml:space="preserve">"... der omfatter alle dele af de ydelser, der skal leveres under Kontrakten."</w:t>
             </w:r>
           </w:p>
         </w:tc>
@@ -1948,37 +1948,7 @@
                 <w:sz w:val="17"/>
                 <w:szCs w:val="17"/>
               </w:rPr>
-              <w:t xml:space="preserve">"Kunden er berettiget, men ikke forpligtet, til i Kontraktens løbetid at udnytte Optionen på udvikling og levering af DVR online, jf. bilag 3A, afsnit 3.5, til det i bilag 12 fastsatte vederlag, jf. punkt 15.8. Kundens udnyttelse af Optionen sker ved Meddelelse."</w:t>
-            </w:r>
-          </w:p>
-          <w:p>
-            <w:pPr>
-              <w:spacing w:after="40"/>
-            </w:pPr>
-            <w:r>
-              <w:rPr>
-                <w:rFonts w:ascii="Verdana" w:cs="Verdana" w:eastAsia="Verdana" w:hAnsi="Verdana"/>
-                <w:b w:val="false"/>
-                <w:bCs w:val="false"/>
-                <w:sz w:val="17"/>
-                <w:szCs w:val="17"/>
-              </w:rPr>
-              <w:t xml:space="preserve">"Leverandøren er forpligtet til at levere de af Optionen omfattede ydelser. Samtlige Kontraktens krav og bestemmelser gælder også for Optionen, medmindre andet udtrykkeligt er angivet."</w:t>
-            </w:r>
-          </w:p>
-          <w:p>
-            <w:pPr>
-              <w:spacing w:after="40"/>
-            </w:pPr>
-            <w:r>
-              <w:rPr>
-                <w:rFonts w:ascii="Verdana" w:cs="Verdana" w:eastAsia="Verdana" w:hAnsi="Verdana"/>
-                <w:b w:val="false"/>
-                <w:bCs w:val="false"/>
-                <w:sz w:val="17"/>
-                <w:szCs w:val="17"/>
-              </w:rPr>
-              <w:t xml:space="preserve">"Udnyttelse af Optionen udgør ikke en ændring, jf. punkt 6.1, og er ikke en bestillingsydelse, jf. punkt 6.3."</w:t>
+              <w:t xml:space="preserve">Tilføjet: "Såfremt Kunden i forbindelse med kontraktunderskrivelsen bestiller Optionen til levering samtidig med og som en del af Leverancen, indgår disse aktiviteter i afklaringsfasen."</w:t>
             </w:r>
           </w:p>
         </w:tc>
@@ -2012,7 +1982,7 @@
                 <w:sz w:val="17"/>
                 <w:szCs w:val="17"/>
               </w:rPr>
-              <w:t xml:space="preserve">Nyt punkt 6.2.1 Option til levering som en del af Leverancen</w:t>
+              <w:t xml:space="preserve">Nyt punkt 6.2 Option til levering som en del af Leverancen</w:t>
             </w:r>
           </w:p>
         </w:tc>
@@ -2076,7 +2046,7 @@
                 <w:sz w:val="17"/>
                 <w:szCs w:val="17"/>
               </w:rPr>
-              <w:t xml:space="preserve">"Udnytter Kunden Optionen senest ved afklaringsfasens afslutning, jf. punkt 5.3.1, leveres Optionen som en del af Leverancen. Optionen afprøves og overtages sammen med Leverancen i overensstemmelse med tidsplanen i bilag 1 og bilag 14, og vederlaget for Optionen tillægges Leverancevederlaget, jf. punkt 15.8."</w:t>
+              <w:t xml:space="preserve">"Såfremt Kunden ved Meddelelse bestiller Optionen, bliver Optionen en del af Leverancen og skal i enhver henseende behandles som om, den oprindeligt var indgået i Kontrakten som en del af Leverancen, herunder med hensyn til afprøvning, Overtagelsesdag og vederlag, medmindre andet er angivet i bilag 3."</w:t>
             </w:r>
           </w:p>
         </w:tc>
@@ -2110,7 +2080,7 @@
                 <w:sz w:val="17"/>
                 <w:szCs w:val="17"/>
               </w:rPr>
-              <w:t xml:space="preserve">Nyt punkt 6.2.2 Option til levering som en Selvstændig Opgave</w:t>
+              <w:t xml:space="preserve">Nyt punkt 6.3 Option til levering som en Selvstændig Opgave</w:t>
             </w:r>
           </w:p>
         </w:tc>
@@ -2174,7 +2144,37 @@
                 <w:sz w:val="17"/>
                 <w:szCs w:val="17"/>
               </w:rPr>
-              <w:t xml:space="preserve">"Udnytter Kunden Optionen efter afklaringsfasens afslutning, leveres Optionen som en Selvstændig Opgave i henhold til en tidsplan, som Parterne aftaler. For Optionen gælder i så fald samme krav til afprøvning, garantier, bod, vedligeholdelse og support, som er gældende for Leverancen, jf. punkt 6.3.2. Vederlaget for Optionen udgør det i bilag 12 fastsatte vederlag, jf. punkt 15.8, og betales i henhold til bilag 12."</w:t>
+              <w:t xml:space="preserve">"Ved bestilling af Optionen, som ikke bestilles som en del af Leverancen, sker sådan levering som en Selvstændig Opgave."</w:t>
+            </w:r>
+          </w:p>
+          <w:p>
+            <w:pPr>
+              <w:spacing w:after="40"/>
+            </w:pPr>
+            <w:r>
+              <w:rPr>
+                <w:rFonts w:ascii="Verdana" w:cs="Verdana" w:eastAsia="Verdana" w:hAnsi="Verdana"/>
+                <w:b w:val="false"/>
+                <w:bCs w:val="false"/>
+                <w:sz w:val="17"/>
+                <w:szCs w:val="17"/>
+              </w:rPr>
+              <w:t xml:space="preserve">"For en sådan Selvstændig Opgave gælder samme krav til afprøvning, garantier, bod, vedligeholdelse og support samt eventuel Drift som er gældende for Leverancen, medmindre andet er angivet i Kontrakten."</w:t>
+            </w:r>
+          </w:p>
+          <w:p>
+            <w:pPr>
+              <w:spacing w:after="40"/>
+            </w:pPr>
+            <w:r>
+              <w:rPr>
+                <w:rFonts w:ascii="Verdana" w:cs="Verdana" w:eastAsia="Verdana" w:hAnsi="Verdana"/>
+                <w:b w:val="false"/>
+                <w:bCs w:val="false"/>
+                <w:sz w:val="17"/>
+                <w:szCs w:val="17"/>
+              </w:rPr>
+              <w:t xml:space="preserve">"Ved opgørelse af bod, erstatning m.v. sker dette på baggrund af det aftalte vederlag for den Selvstændige Opgave, inkl. estimat for timebaserede ydelser, og eventuelle garantisvigt eller anden form for misligholdelse relateret til disse opgaver behandles uafhængigt af Leverancen i øvrigt."</w:t>
             </w:r>
           </w:p>
         </w:tc>
@@ -2208,7 +2208,7 @@
                 <w:sz w:val="17"/>
                 <w:szCs w:val="17"/>
               </w:rPr>
-              <w:t xml:space="preserve">Punkt 7, 10, 15.2 og 20.1: krydshenvisninger</w:t>
+              <w:t xml:space="preserve">Følgevirkning af nyt 6.2 og 6.3</w:t>
             </w:r>
           </w:p>
         </w:tc>
@@ -2240,7 +2240,7 @@
                 <w:sz w:val="17"/>
                 <w:szCs w:val="17"/>
               </w:rPr>
-              <w:t xml:space="preserve">"jf. punkt 6.2.2" (fire steder)</w:t>
+              <w:t xml:space="preserve">Bestillingsydelser var 6.2 (6.2.1, 6.2.2), Øvrige ændringer 6.3, Ændringer uden samtykke 6.4, Ny driftsleverandør 6.5</w:t>
             </w:r>
           </w:p>
         </w:tc>
@@ -2272,7 +2272,7 @@
                 <w:sz w:val="17"/>
                 <w:szCs w:val="17"/>
               </w:rPr>
-              <w:t xml:space="preserve">"jf. punkt 6.3.2"</w:t>
+              <w:t xml:space="preserve">Bestillingsydelser er nu 6.4 (6.4.1, 6.4.2), Øvrige ændringer 6.5, Ændringer uden samtykke 6.6, Ny driftsleverandør 6.7</w:t>
             </w:r>
           </w:p>
         </w:tc>
@@ -2306,7 +2306,7 @@
                 <w:sz w:val="17"/>
                 <w:szCs w:val="17"/>
               </w:rPr>
-              <w:t xml:space="preserve">Punkt 7 Tidsplan, andet afsnit</w:t>
+              <w:t xml:space="preserve">Punkt 15.2, afsnit om Selvstændig Opgave</w:t>
             </w:r>
           </w:p>
         </w:tc>
@@ -2338,7 +2338,7 @@
                 <w:sz w:val="17"/>
                 <w:szCs w:val="17"/>
               </w:rPr>
-              <w:t xml:space="preserve">"... skal leveres i henhold til den tidsplan, der aftales herfor."</w:t>
+              <w:t xml:space="preserve">"Ved ændringer, der leveres som en Selvstændig Opgave, jf. punkt 6.2.2, ..."</w:t>
             </w:r>
           </w:p>
         </w:tc>
@@ -2370,7 +2370,7 @@
                 <w:sz w:val="17"/>
                 <w:szCs w:val="17"/>
               </w:rPr>
-              <w:t xml:space="preserve">Tilføjet: "Tilsvarende gælder for Optionen, når denne leveres som en Selvstændig Opgave, jf. punkt 6.2.2."</w:t>
+              <w:t xml:space="preserve">"Ved ændringer, herunder Optioner, der leveres som en Selvstændig Opgave, jf. punkt 6.4.2, ..." (nummeret er et felt)</w:t>
             </w:r>
           </w:p>
         </w:tc>
@@ -2404,7 +2404,7 @@
                 <w:sz w:val="17"/>
                 <w:szCs w:val="17"/>
               </w:rPr>
-              <w:t xml:space="preserve">Punkt 8 Afprøvning, første afsnit</w:t>
+              <w:t xml:space="preserve">Nyt punkt 15.3 Optionen</w:t>
             </w:r>
           </w:p>
         </w:tc>
@@ -2436,7 +2436,7 @@
                 <w:sz w:val="17"/>
                 <w:szCs w:val="17"/>
               </w:rPr>
-              <w:t xml:space="preserve">"Afprøvning af Løsningen og Dokumentationen sker ved en overtagelsesprøve og en driftsprøve."</w:t>
+              <w:t xml:space="preserve">(ny)</w:t>
             </w:r>
           </w:p>
         </w:tc>
@@ -2468,7 +2468,7 @@
                 <w:sz w:val="17"/>
                 <w:szCs w:val="17"/>
               </w:rPr>
-              <w:t xml:space="preserve">Tilføjet: "Afprøvning af Optionen sker i overensstemmelse med bilag 14."</w:t>
+              <w:t xml:space="preserve">"Vederlag for Optionen fremgår af bilag 12." Tilføjet af Claude: "Ved Kundens udnyttelse af Optionen forhøjes det faste månedlige vederlag for vedligeholdelse og support med det i bilag 12 angivne tillæg fra det tidspunkt, hvor Optionen er overtaget, jf. punkt 15.6."</w:t>
             </w:r>
           </w:p>
         </w:tc>
@@ -2502,7 +2502,7 @@
                 <w:sz w:val="17"/>
                 <w:szCs w:val="17"/>
               </w:rPr>
-              <w:t xml:space="preserve">Punkt 10 Overtagelse, sidste afsnit</w:t>
+              <w:t xml:space="preserve">Følgevirkning af nyt 15.3</w:t>
             </w:r>
           </w:p>
         </w:tc>
@@ -2534,7 +2534,7 @@
                 <w:sz w:val="17"/>
                 <w:szCs w:val="17"/>
               </w:rPr>
-              <w:t xml:space="preserve">"For ændringer, der bestilles til levering som en Selvstændig Opgave, jf. punkt 6.2.2, sker overtagelse ..."</w:t>
+              <w:t xml:space="preserve">Vederlag for bestillingsydelser var 15.3, øvrige timebaserede 15.4, vedligeholdelse 15.5, licens 15.6, arbejdscomputere 15.7, betalingsbetingelser 15.8</w:t>
             </w:r>
           </w:p>
         </w:tc>
@@ -2566,248 +2566,7 @@
                 <w:sz w:val="17"/>
                 <w:szCs w:val="17"/>
               </w:rPr>
-              <w:t xml:space="preserve">"For ændringer og Optionen, der leveres som en Selvstændig Opgave, jf. punkt 6.3.2, sker overtagelse ..."</w:t>
-            </w:r>
-          </w:p>
-        </w:tc>
-      </w:tr>
-      <w:tr>
-        <w:tc>
-          <w:tcPr>
-            <w:tcW w:type="dxa" w:w="1900"/>
-            <w:tcBorders>
-              <w:top w:val="single" w:color="999999" w:sz="4"/>
-              <w:left w:val="single" w:color="999999" w:sz="4"/>
-              <w:bottom w:val="single" w:color="999999" w:sz="4"/>
-              <w:right w:val="single" w:color="999999" w:sz="4"/>
-            </w:tcBorders>
-            <w:tcMar>
-              <w:top w:type="dxa" w:w="60"/>
-              <w:left w:type="dxa" w:w="80"/>
-              <w:bottom w:type="dxa" w:w="60"/>
-              <w:right w:type="dxa" w:w="80"/>
-            </w:tcMar>
-          </w:tcPr>
-          <w:p>
-            <w:pPr>
-              <w:spacing w:after="40"/>
-            </w:pPr>
-            <w:r>
-              <w:rPr>
-                <w:rFonts w:ascii="Verdana" w:cs="Verdana" w:eastAsia="Verdana" w:hAnsi="Verdana"/>
-                <w:b w:val="false"/>
-                <w:bCs w:val="false"/>
-                <w:sz w:val="17"/>
-                <w:szCs w:val="17"/>
-              </w:rPr>
-              <w:t xml:space="preserve">Punkt 15.2 Leverancevederlag, undtagelsesliste</w:t>
-            </w:r>
-          </w:p>
-        </w:tc>
-        <w:tc>
-          <w:tcPr>
-            <w:tcW w:type="dxa" w:w="3500"/>
-            <w:tcBorders>
-              <w:top w:val="single" w:color="999999" w:sz="4"/>
-              <w:left w:val="single" w:color="999999" w:sz="4"/>
-              <w:bottom w:val="single" w:color="999999" w:sz="4"/>
-              <w:right w:val="single" w:color="999999" w:sz="4"/>
-            </w:tcBorders>
-            <w:tcMar>
-              <w:top w:type="dxa" w:w="60"/>
-              <w:left w:type="dxa" w:w="80"/>
-              <w:bottom w:type="dxa" w:w="60"/>
-              <w:right w:type="dxa" w:w="80"/>
-            </w:tcMar>
-          </w:tcPr>
-          <w:p>
-            <w:pPr>
-              <w:spacing w:after="40"/>
-            </w:pPr>
-            <w:r>
-              <w:rPr>
-                <w:rFonts w:ascii="Verdana" w:cs="Verdana" w:eastAsia="Verdana" w:hAnsi="Verdana"/>
-                <w:b w:val="false"/>
-                <w:bCs w:val="false"/>
-                <w:sz w:val="17"/>
-                <w:szCs w:val="17"/>
-              </w:rPr>
-              <w:t xml:space="preserve">(ny linje)</w:t>
-            </w:r>
-          </w:p>
-        </w:tc>
-        <w:tc>
-          <w:tcPr>
-            <w:tcW w:type="dxa" w:w="3600"/>
-            <w:tcBorders>
-              <w:top w:val="single" w:color="999999" w:sz="4"/>
-              <w:left w:val="single" w:color="999999" w:sz="4"/>
-              <w:bottom w:val="single" w:color="999999" w:sz="4"/>
-              <w:right w:val="single" w:color="999999" w:sz="4"/>
-            </w:tcBorders>
-            <w:tcMar>
-              <w:top w:type="dxa" w:w="60"/>
-              <w:left w:type="dxa" w:w="80"/>
-              <w:bottom w:type="dxa" w:w="60"/>
-              <w:right w:type="dxa" w:w="80"/>
-            </w:tcMar>
-          </w:tcPr>
-          <w:p>
-            <w:pPr>
-              <w:spacing w:after="40"/>
-            </w:pPr>
-            <w:r>
-              <w:rPr>
-                <w:rFonts w:ascii="Verdana" w:cs="Verdana" w:eastAsia="Verdana" w:hAnsi="Verdana"/>
-                <w:b w:val="false"/>
-                <w:bCs w:val="false"/>
-                <w:sz w:val="17"/>
-                <w:szCs w:val="17"/>
-              </w:rPr>
-              <w:t xml:space="preserve">"Vederlag for Optionen, jf. punkt 15.8"</w:t>
-            </w:r>
-          </w:p>
-        </w:tc>
-      </w:tr>
-      <w:tr>
-        <w:tc>
-          <w:tcPr>
-            <w:tcW w:type="dxa" w:w="1900"/>
-            <w:tcBorders>
-              <w:top w:val="single" w:color="999999" w:sz="4"/>
-              <w:left w:val="single" w:color="999999" w:sz="4"/>
-              <w:bottom w:val="single" w:color="999999" w:sz="4"/>
-              <w:right w:val="single" w:color="999999" w:sz="4"/>
-            </w:tcBorders>
-            <w:tcMar>
-              <w:top w:type="dxa" w:w="60"/>
-              <w:left w:type="dxa" w:w="80"/>
-              <w:bottom w:type="dxa" w:w="60"/>
-              <w:right w:type="dxa" w:w="80"/>
-            </w:tcMar>
-          </w:tcPr>
-          <w:p>
-            <w:pPr>
-              <w:spacing w:after="40"/>
-            </w:pPr>
-            <w:r>
-              <w:rPr>
-                <w:rFonts w:ascii="Verdana" w:cs="Verdana" w:eastAsia="Verdana" w:hAnsi="Verdana"/>
-                <w:b w:val="false"/>
-                <w:bCs w:val="false"/>
-                <w:sz w:val="17"/>
-                <w:szCs w:val="17"/>
-              </w:rPr>
-              <w:t xml:space="preserve">Nyt punkt 15.8 Vederlag for Optionen (før Betalingsbetingelser)</w:t>
-            </w:r>
-          </w:p>
-        </w:tc>
-        <w:tc>
-          <w:tcPr>
-            <w:tcW w:type="dxa" w:w="3500"/>
-            <w:tcBorders>
-              <w:top w:val="single" w:color="999999" w:sz="4"/>
-              <w:left w:val="single" w:color="999999" w:sz="4"/>
-              <w:bottom w:val="single" w:color="999999" w:sz="4"/>
-              <w:right w:val="single" w:color="999999" w:sz="4"/>
-            </w:tcBorders>
-            <w:tcMar>
-              <w:top w:type="dxa" w:w="60"/>
-              <w:left w:type="dxa" w:w="80"/>
-              <w:bottom w:type="dxa" w:w="60"/>
-              <w:right w:type="dxa" w:w="80"/>
-            </w:tcMar>
-          </w:tcPr>
-          <w:p>
-            <w:pPr>
-              <w:spacing w:after="40"/>
-            </w:pPr>
-            <w:r>
-              <w:rPr>
-                <w:rFonts w:ascii="Verdana" w:cs="Verdana" w:eastAsia="Verdana" w:hAnsi="Verdana"/>
-                <w:b w:val="false"/>
-                <w:bCs w:val="false"/>
-                <w:sz w:val="17"/>
-                <w:szCs w:val="17"/>
-              </w:rPr>
-              <w:t xml:space="preserve">(ny)</w:t>
-            </w:r>
-          </w:p>
-        </w:tc>
-        <w:tc>
-          <w:tcPr>
-            <w:tcW w:type="dxa" w:w="3600"/>
-            <w:tcBorders>
-              <w:top w:val="single" w:color="999999" w:sz="4"/>
-              <w:left w:val="single" w:color="999999" w:sz="4"/>
-              <w:bottom w:val="single" w:color="999999" w:sz="4"/>
-              <w:right w:val="single" w:color="999999" w:sz="4"/>
-            </w:tcBorders>
-            <w:tcMar>
-              <w:top w:type="dxa" w:w="60"/>
-              <w:left w:type="dxa" w:w="80"/>
-              <w:bottom w:type="dxa" w:w="60"/>
-              <w:right w:type="dxa" w:w="80"/>
-            </w:tcMar>
-          </w:tcPr>
-          <w:p>
-            <w:pPr>
-              <w:spacing w:after="40"/>
-            </w:pPr>
-            <w:r>
-              <w:rPr>
-                <w:rFonts w:ascii="Verdana" w:cs="Verdana" w:eastAsia="Verdana" w:hAnsi="Verdana"/>
-                <w:b w:val="false"/>
-                <w:bCs w:val="false"/>
-                <w:sz w:val="17"/>
-                <w:szCs w:val="17"/>
-              </w:rPr>
-              <w:t xml:space="preserve">"Vederlaget for Optionen er fastsat i bilag 12 og omfatter samtlige ydelser, der er omfattet af Optionen, jf. bilag 3A, afsnit 2.1, 2.3 og 3.5, herunder udvikling, levering, afprøvning og Dokumentation af DVR online."</w:t>
-            </w:r>
-          </w:p>
-          <w:p>
-            <w:pPr>
-              <w:spacing w:after="40"/>
-            </w:pPr>
-            <w:r>
-              <w:rPr>
-                <w:rFonts w:ascii="Verdana" w:cs="Verdana" w:eastAsia="Verdana" w:hAnsi="Verdana"/>
-                <w:b w:val="false"/>
-                <w:bCs w:val="false"/>
-                <w:sz w:val="17"/>
-                <w:szCs w:val="17"/>
-              </w:rPr>
-              <w:t xml:space="preserve">"Leveres Optionen som en del af Leverancen, jf. punkt 6.2.1, tillægges vederlaget for Optionen Leverancevederlaget og betales i henhold til betalingsplanen i bilag 12. Leveres Optionen som en Selvstændig Opgave, jf. punkt 6.2.2, betales vederlaget for Optionen i henhold til bilag 12."</w:t>
-            </w:r>
-          </w:p>
-          <w:p>
-            <w:pPr>
-              <w:spacing w:after="40"/>
-            </w:pPr>
-            <w:r>
-              <w:rPr>
-                <w:rFonts w:ascii="Verdana" w:cs="Verdana" w:eastAsia="Verdana" w:hAnsi="Verdana"/>
-                <w:b w:val="false"/>
-                <w:bCs w:val="false"/>
-                <w:sz w:val="17"/>
-                <w:szCs w:val="17"/>
-              </w:rPr>
-              <w:t xml:space="preserve">"Ved Kundens udnyttelse af Optionen forhøjes det faste månedlige vederlag for vedligeholdelse og support med det i bilag 12 angivne tillæg fra det tidspunkt, hvor Optionen er overtaget, jf. punkt 15.5."</w:t>
-            </w:r>
-          </w:p>
-          <w:p>
-            <w:pPr>
-              <w:spacing w:after="40"/>
-            </w:pPr>
-            <w:r>
-              <w:rPr>
-                <w:rFonts w:ascii="Verdana" w:cs="Verdana" w:eastAsia="Verdana" w:hAnsi="Verdana"/>
-                <w:b w:val="false"/>
-                <w:bCs w:val="false"/>
-                <w:sz w:val="17"/>
-                <w:szCs w:val="17"/>
-              </w:rPr>
-              <w:t xml:space="preserve">"Leverandøren har ikke krav på vederlag for Optionen, medmindre Kunden udnytter denne."</w:t>
+              <w:t xml:space="preserve">Nu 15.4, 15.5, 15.6, 15.7, 15.8 og 15.9. Henvisninger til "Kontraktens punkt 15.3" i bilag 09 og bilag 12 er derfor rettet til 15.4 (se nedenfor).</w:t>
             </w:r>
           </w:p>
         </w:tc>
@@ -3043,7 +2802,7 @@
                 <w:sz w:val="17"/>
                 <w:szCs w:val="17"/>
               </w:rPr>
-              <w:t xml:space="preserve">"DVR online udbydes som en Option, jf. Kontraktens punkt 6.2. Kravene til Optionen fremgår af afsnit 2.1, 2.3 og 3.5 og prissættes særskilt i bilag 12, Appendiks A, punkt 8."</w:t>
+              <w:t xml:space="preserve">"DVR online udbydes som en Option, jf. Kontraktens punkt 6.2 og 6.3. Kravene til Optionen fremgår af afsnit 2.1, 2.3 og 3.5 og prissættes særskilt i bilag 12, Appendiks A, punkt 8."</w:t>
             </w:r>
           </w:p>
         </w:tc>
@@ -3337,7 +3096,7 @@
                 <w:sz w:val="17"/>
                 <w:szCs w:val="17"/>
               </w:rPr>
-              <w:t xml:space="preserve">"Kravene i dette afsnit er omfattet af Optionen, jf. Kontraktens punkt 6.2, og prissættes særskilt i bilag 12, Appendiks A, punkt 8. Kravene besvares i Kravmatrixen på samme måde som Kravspecifikationens øvrige krav, uanset om Kunden udnytter Optionen."</w:t>
+              <w:t xml:space="preserve">"Kravene i dette afsnit er omfattet af Optionen, jf. Kontraktens punkt 6.2 og 6.3, og prissættes særskilt i bilag 12, Appendiks A, punkt 8. Kravene besvares i Kravmatrixen på samme måde som Kravspecifikationens øvrige krav, uanset om Kunden udnytter Optionen."</w:t>
             </w:r>
           </w:p>
         </w:tc>
@@ -4807,7 +4566,7 @@
                 <w:sz w:val="17"/>
                 <w:szCs w:val="17"/>
               </w:rPr>
-              <w:t xml:space="preserve">Option: "Kundens ret, men ikke pligt, til at bestille udvikling og levering af DVR online, jf. Kontraktens punkt 6.2 og afsnit 3.5 i denne kravspecifikation."</w:t>
+              <w:t xml:space="preserve">Option: "Kundens ret, men ikke pligt, til at bestille udvikling og levering af DVR online, jf. Kontraktens punkt 6.2 og 6.3 samt afsnit 3.5 i denne kravspecifikation."</w:t>
             </w:r>
           </w:p>
         </w:tc>
@@ -5196,7 +4955,7 @@
                 <w:sz w:val="17"/>
                 <w:szCs w:val="17"/>
               </w:rPr>
-              <w:t xml:space="preserve">"Udnyttes Optionen til levering som en del af Leverancen, jf. Kontraktens punkt 6.2.1, tillægges vederlaget for Optionen, jf. punkt 8, Leverancevederlaget og faktureres efter betalingsplanen nedenfor."</w:t>
+              <w:t xml:space="preserve">"Udnyttes Optionen til levering som en del af Leverancen, jf. Kontraktens punkt 6.2, tillægges vederlaget for Optionen, jf. punkt 8, Leverancevederlaget og faktureres efter betalingsplanen nedenfor."</w:t>
             </w:r>
           </w:p>
         </w:tc>
@@ -5294,7 +5053,7 @@
                 <w:sz w:val="17"/>
                 <w:szCs w:val="17"/>
               </w:rPr>
-              <w:t xml:space="preserve">"Vederlaget for Optionen på udvikling og levering af DVR online, jf. Kontraktens punkt 6.2 og 15.8 samt bilag 3A, afsnit 3.5, fremgår af Appendiks A, punkt 8."</w:t>
+              <w:t xml:space="preserve">"Vederlaget for Optionen på udvikling og levering af DVR online, jf. Kontraktens punkt 6.2, 6.3 og 15.3 samt bilag 3A, afsnit 3.5, fremgår af Appendiks A, punkt 8."</w:t>
             </w:r>
           </w:p>
           <w:p>
@@ -5340,6 +5099,104 @@
                 <w:szCs w:val="17"/>
               </w:rPr>
               <w:t xml:space="preserve">"Vederlaget for Optionen indgår i den samlede tilbudstekniske pris, jf. Appendiks A, uanset om Kunden udnytter Optionen. Leverandøren har alene krav på vederlaget, såfremt Kunden udnytter Optionen."</w:t>
+            </w:r>
+          </w:p>
+        </w:tc>
+      </w:tr>
+      <w:tr>
+        <w:tc>
+          <w:tcPr>
+            <w:tcW w:type="dxa" w:w="1900"/>
+            <w:tcBorders>
+              <w:top w:val="single" w:color="999999" w:sz="4"/>
+              <w:left w:val="single" w:color="999999" w:sz="4"/>
+              <w:bottom w:val="single" w:color="999999" w:sz="4"/>
+              <w:right w:val="single" w:color="999999" w:sz="4"/>
+            </w:tcBorders>
+            <w:tcMar>
+              <w:top w:type="dxa" w:w="60"/>
+              <w:left w:type="dxa" w:w="80"/>
+              <w:bottom w:type="dxa" w:w="60"/>
+              <w:right w:type="dxa" w:w="80"/>
+            </w:tcMar>
+          </w:tcPr>
+          <w:p>
+            <w:pPr>
+              <w:spacing w:after="40"/>
+            </w:pPr>
+            <w:r>
+              <w:rPr>
+                <w:rFonts w:ascii="Verdana" w:cs="Verdana" w:eastAsia="Verdana" w:hAnsi="Verdana"/>
+                <w:b w:val="false"/>
+                <w:bCs w:val="false"/>
+                <w:sz w:val="17"/>
+                <w:szCs w:val="17"/>
+              </w:rPr>
+              <w:t xml:space="preserve">Punkt 5.1, første afsnit</w:t>
+            </w:r>
+          </w:p>
+        </w:tc>
+        <w:tc>
+          <w:tcPr>
+            <w:tcW w:type="dxa" w:w="3500"/>
+            <w:tcBorders>
+              <w:top w:val="single" w:color="999999" w:sz="4"/>
+              <w:left w:val="single" w:color="999999" w:sz="4"/>
+              <w:bottom w:val="single" w:color="999999" w:sz="4"/>
+              <w:right w:val="single" w:color="999999" w:sz="4"/>
+            </w:tcBorders>
+            <w:tcMar>
+              <w:top w:type="dxa" w:w="60"/>
+              <w:left w:type="dxa" w:w="80"/>
+              <w:bottom w:type="dxa" w:w="60"/>
+              <w:right w:type="dxa" w:w="80"/>
+            </w:tcMar>
+          </w:tcPr>
+          <w:p>
+            <w:pPr>
+              <w:spacing w:after="40"/>
+            </w:pPr>
+            <w:r>
+              <w:rPr>
+                <w:rFonts w:ascii="Verdana" w:cs="Verdana" w:eastAsia="Verdana" w:hAnsi="Verdana"/>
+                <w:b w:val="false"/>
+                <w:bCs w:val="false"/>
+                <w:sz w:val="17"/>
+                <w:szCs w:val="17"/>
+              </w:rPr>
+              <w:t xml:space="preserve">"... jf. Kontraktens punkt 15.3:"</w:t>
+            </w:r>
+          </w:p>
+        </w:tc>
+        <w:tc>
+          <w:tcPr>
+            <w:tcW w:type="dxa" w:w="3600"/>
+            <w:tcBorders>
+              <w:top w:val="single" w:color="999999" w:sz="4"/>
+              <w:left w:val="single" w:color="999999" w:sz="4"/>
+              <w:bottom w:val="single" w:color="999999" w:sz="4"/>
+              <w:right w:val="single" w:color="999999" w:sz="4"/>
+            </w:tcBorders>
+            <w:tcMar>
+              <w:top w:type="dxa" w:w="60"/>
+              <w:left w:type="dxa" w:w="80"/>
+              <w:bottom w:type="dxa" w:w="60"/>
+              <w:right w:type="dxa" w:w="80"/>
+            </w:tcMar>
+          </w:tcPr>
+          <w:p>
+            <w:pPr>
+              <w:spacing w:after="40"/>
+            </w:pPr>
+            <w:r>
+              <w:rPr>
+                <w:rFonts w:ascii="Verdana" w:cs="Verdana" w:eastAsia="Verdana" w:hAnsi="Verdana"/>
+                <w:b w:val="false"/>
+                <w:bCs w:val="false"/>
+                <w:sz w:val="17"/>
+                <w:szCs w:val="17"/>
+              </w:rPr>
+              <w:t xml:space="preserve">"... jf. Kontraktens punkt 15.4:" (følge af Kontraktens nye punkt 15.3)</w:t>
             </w:r>
           </w:p>
         </w:tc>
@@ -6252,7 +6109,7 @@
                 <w:sz w:val="17"/>
                 <w:szCs w:val="17"/>
               </w:rPr>
-              <w:t xml:space="preserve">"Der skal desuden gives tilbud på en option på udvikling og levering af DVR online (webbaseret brugergrænseflade til dyrlæger), jf. Kontraktens punkt 6.2, bilag 3A, afsnit 3.5, og bilag 12, punkt 8."</w:t>
+              <w:t xml:space="preserve">"Der skal desuden gives tilbud på en option på udvikling og levering af DVR online (webbaseret brugergrænseflade til dyrlæger), jf. Kontraktens punkt 6.2 og 6.3, bilag 3A, afsnit 3.5, og bilag 12, punkt 8."</w:t>
             </w:r>
           </w:p>
         </w:tc>
@@ -6684,7 +6541,7 @@
                 <w:sz w:val="17"/>
                 <w:szCs w:val="17"/>
               </w:rPr>
-              <w:t xml:space="preserve">"Afklaring af, om Kunden udnytter Optionen på DVR online, jf. Kontraktens punkt 6.2.1, og i givet fald indarbejdelse af aktiviteterne vedrørende Optionen i tidsplanen."</w:t>
+              <w:t xml:space="preserve">"Afklaring af, om Kunden udnytter Optionen på DVR online, jf. Kontraktens punkt 6.2, og i givet fald indarbejdelse af aktiviteterne vedrørende Optionen i tidsplanen."</w:t>
             </w:r>
           </w:p>
         </w:tc>
@@ -7018,7 +6875,7 @@
                 <w:sz w:val="17"/>
                 <w:szCs w:val="17"/>
               </w:rPr>
-              <w:t xml:space="preserve">"Prøveforløbet finder tilsvarende anvendelse for Optionen på DVR online, jf. Kontraktens punkt 6.2, uanset om Optionen leveres som en del af Leverancen eller som en Selvstændig Opgave."</w:t>
+              <w:t xml:space="preserve">"Prøveforløbet finder tilsvarende anvendelse for Optionen på DVR online, jf. Kontraktens punkt 6.2 og 6.3, uanset om Optionen leveres som en del af Leverancen eller som en Selvstændig Opgave."</w:t>
             </w:r>
           </w:p>
         </w:tc>
@@ -7037,7 +6894,243 @@
           <w:sz w:val="22"/>
           <w:szCs w:val="22"/>
         </w:rPr>
-        <w:t xml:space="preserve">3.9 Dokumenter uden ændringer</w:t>
+        <w:t xml:space="preserve">3.9 Bilag 09 Ændringshåndtering (20.)</w:t>
+      </w:r>
+    </w:p>
+    <w:tbl>
+      <w:tblPr>
+        <w:tblW w:type="dxa" w:w="9000"/>
+        <w:tblBorders>
+          <w:top w:val="single" w:color="auto" w:sz="4"/>
+          <w:left w:val="single" w:color="auto" w:sz="4"/>
+          <w:bottom w:val="single" w:color="auto" w:sz="4"/>
+          <w:right w:val="single" w:color="auto" w:sz="4"/>
+          <w:insideH w:val="single" w:color="auto" w:sz="4"/>
+          <w:insideV w:val="single" w:color="auto" w:sz="4"/>
+        </w:tblBorders>
+      </w:tblPr>
+      <w:tblGrid>
+        <w:gridCol w:w="1900"/>
+        <w:gridCol w:w="3500"/>
+        <w:gridCol w:w="3600"/>
+      </w:tblGrid>
+      <w:tr>
+        <w:trPr>
+          <w:tblHeader/>
+        </w:trPr>
+        <w:tc>
+          <w:tcPr>
+            <w:tcW w:type="dxa" w:w="1900"/>
+            <w:tcBorders>
+              <w:top w:val="single" w:color="999999" w:sz="4"/>
+              <w:left w:val="single" w:color="999999" w:sz="4"/>
+              <w:bottom w:val="single" w:color="999999" w:sz="4"/>
+              <w:right w:val="single" w:color="999999" w:sz="4"/>
+            </w:tcBorders>
+            <w:shd w:fill="D9E2F3" w:color="auto" w:val="clear"/>
+            <w:tcMar>
+              <w:top w:type="dxa" w:w="60"/>
+              <w:left w:type="dxa" w:w="80"/>
+              <w:bottom w:type="dxa" w:w="60"/>
+              <w:right w:type="dxa" w:w="80"/>
+            </w:tcMar>
+          </w:tcPr>
+          <w:p>
+            <w:pPr>
+              <w:spacing w:after="40"/>
+            </w:pPr>
+            <w:r>
+              <w:rPr>
+                <w:rFonts w:ascii="Verdana" w:cs="Verdana" w:eastAsia="Verdana" w:hAnsi="Verdana"/>
+                <w:b/>
+                <w:bCs/>
+                <w:sz w:val="18"/>
+                <w:szCs w:val="18"/>
+              </w:rPr>
+              <w:t xml:space="preserve">Sted</w:t>
+            </w:r>
+          </w:p>
+        </w:tc>
+        <w:tc>
+          <w:tcPr>
+            <w:tcW w:type="dxa" w:w="3500"/>
+            <w:tcBorders>
+              <w:top w:val="single" w:color="999999" w:sz="4"/>
+              <w:left w:val="single" w:color="999999" w:sz="4"/>
+              <w:bottom w:val="single" w:color="999999" w:sz="4"/>
+              <w:right w:val="single" w:color="999999" w:sz="4"/>
+            </w:tcBorders>
+            <w:shd w:fill="D9E2F3" w:color="auto" w:val="clear"/>
+            <w:tcMar>
+              <w:top w:type="dxa" w:w="60"/>
+              <w:left w:type="dxa" w:w="80"/>
+              <w:bottom w:type="dxa" w:w="60"/>
+              <w:right w:type="dxa" w:w="80"/>
+            </w:tcMar>
+          </w:tcPr>
+          <w:p>
+            <w:pPr>
+              <w:spacing w:after="40"/>
+            </w:pPr>
+            <w:r>
+              <w:rPr>
+                <w:rFonts w:ascii="Verdana" w:cs="Verdana" w:eastAsia="Verdana" w:hAnsi="Verdana"/>
+                <w:b/>
+                <w:bCs/>
+                <w:sz w:val="18"/>
+                <w:szCs w:val="18"/>
+              </w:rPr>
+              <w:t xml:space="preserve">Oprindelig ordlyd</w:t>
+            </w:r>
+          </w:p>
+        </w:tc>
+        <w:tc>
+          <w:tcPr>
+            <w:tcW w:type="dxa" w:w="3600"/>
+            <w:tcBorders>
+              <w:top w:val="single" w:color="999999" w:sz="4"/>
+              <w:left w:val="single" w:color="999999" w:sz="4"/>
+              <w:bottom w:val="single" w:color="999999" w:sz="4"/>
+              <w:right w:val="single" w:color="999999" w:sz="4"/>
+            </w:tcBorders>
+            <w:shd w:fill="D9E2F3" w:color="auto" w:val="clear"/>
+            <w:tcMar>
+              <w:top w:type="dxa" w:w="60"/>
+              <w:left w:type="dxa" w:w="80"/>
+              <w:bottom w:type="dxa" w:w="60"/>
+              <w:right w:type="dxa" w:w="80"/>
+            </w:tcMar>
+          </w:tcPr>
+          <w:p>
+            <w:pPr>
+              <w:spacing w:after="40"/>
+            </w:pPr>
+            <w:r>
+              <w:rPr>
+                <w:rFonts w:ascii="Verdana" w:cs="Verdana" w:eastAsia="Verdana" w:hAnsi="Verdana"/>
+                <w:b/>
+                <w:bCs/>
+                <w:sz w:val="18"/>
+                <w:szCs w:val="18"/>
+              </w:rPr>
+              <w:t xml:space="preserve">Ny ordlyd</w:t>
+            </w:r>
+          </w:p>
+        </w:tc>
+      </w:tr>
+      <w:tr>
+        <w:tc>
+          <w:tcPr>
+            <w:tcW w:type="dxa" w:w="1900"/>
+            <w:tcBorders>
+              <w:top w:val="single" w:color="999999" w:sz="4"/>
+              <w:left w:val="single" w:color="999999" w:sz="4"/>
+              <w:bottom w:val="single" w:color="999999" w:sz="4"/>
+              <w:right w:val="single" w:color="999999" w:sz="4"/>
+            </w:tcBorders>
+            <w:tcMar>
+              <w:top w:type="dxa" w:w="60"/>
+              <w:left w:type="dxa" w:w="80"/>
+              <w:bottom w:type="dxa" w:w="60"/>
+              <w:right w:type="dxa" w:w="80"/>
+            </w:tcMar>
+          </w:tcPr>
+          <w:p>
+            <w:pPr>
+              <w:spacing w:after="40"/>
+            </w:pPr>
+            <w:r>
+              <w:rPr>
+                <w:rFonts w:ascii="Verdana" w:cs="Verdana" w:eastAsia="Verdana" w:hAnsi="Verdana"/>
+                <w:b w:val="false"/>
+                <w:bCs w:val="false"/>
+                <w:sz w:val="17"/>
+                <w:szCs w:val="17"/>
+              </w:rPr>
+              <w:t xml:space="preserve">Afsnit 2.1, 2.3 og 3.1: tre henvisninger</w:t>
+            </w:r>
+          </w:p>
+        </w:tc>
+        <w:tc>
+          <w:tcPr>
+            <w:tcW w:type="dxa" w:w="3500"/>
+            <w:tcBorders>
+              <w:top w:val="single" w:color="999999" w:sz="4"/>
+              <w:left w:val="single" w:color="999999" w:sz="4"/>
+              <w:bottom w:val="single" w:color="999999" w:sz="4"/>
+              <w:right w:val="single" w:color="999999" w:sz="4"/>
+            </w:tcBorders>
+            <w:tcMar>
+              <w:top w:type="dxa" w:w="60"/>
+              <w:left w:type="dxa" w:w="80"/>
+              <w:bottom w:type="dxa" w:w="60"/>
+              <w:right w:type="dxa" w:w="80"/>
+            </w:tcMar>
+          </w:tcPr>
+          <w:p>
+            <w:pPr>
+              <w:spacing w:after="40"/>
+            </w:pPr>
+            <w:r>
+              <w:rPr>
+                <w:rFonts w:ascii="Verdana" w:cs="Verdana" w:eastAsia="Verdana" w:hAnsi="Verdana"/>
+                <w:b w:val="false"/>
+                <w:bCs w:val="false"/>
+                <w:sz w:val="17"/>
+                <w:szCs w:val="17"/>
+              </w:rPr>
+              <w:t xml:space="preserve">"... jf. Kontraktens punkt 15.3"</w:t>
+            </w:r>
+          </w:p>
+        </w:tc>
+        <w:tc>
+          <w:tcPr>
+            <w:tcW w:type="dxa" w:w="3600"/>
+            <w:tcBorders>
+              <w:top w:val="single" w:color="999999" w:sz="4"/>
+              <w:left w:val="single" w:color="999999" w:sz="4"/>
+              <w:bottom w:val="single" w:color="999999" w:sz="4"/>
+              <w:right w:val="single" w:color="999999" w:sz="4"/>
+            </w:tcBorders>
+            <w:tcMar>
+              <w:top w:type="dxa" w:w="60"/>
+              <w:left w:type="dxa" w:w="80"/>
+              <w:bottom w:type="dxa" w:w="60"/>
+              <w:right w:type="dxa" w:w="80"/>
+            </w:tcMar>
+          </w:tcPr>
+          <w:p>
+            <w:pPr>
+              <w:spacing w:after="40"/>
+            </w:pPr>
+            <w:r>
+              <w:rPr>
+                <w:rFonts w:ascii="Verdana" w:cs="Verdana" w:eastAsia="Verdana" w:hAnsi="Verdana"/>
+                <w:b w:val="false"/>
+                <w:bCs w:val="false"/>
+                <w:sz w:val="17"/>
+                <w:szCs w:val="17"/>
+              </w:rPr>
+              <w:t xml:space="preserve">"... jf. Kontraktens punkt 15.4" (følge af Kontraktens nye punkt 15.3; intet andet er ændret, da Optionen ikke er en bestillingsydelse)</w:t>
+            </w:r>
+          </w:p>
+        </w:tc>
+      </w:tr>
+    </w:tbl>
+    <w:p>
+      <w:pPr>
+        <w:pStyle w:val="Heading2"/>
+        <w:spacing w:after="120" w:before="240"/>
+      </w:pPr>
+      <w:r>
+        <w:rPr>
+          <w:rFonts w:ascii="Verdana" w:cs="Verdana" w:eastAsia="Verdana" w:hAnsi="Verdana"/>
+          <w:b/>
+          <w:bCs/>
+          <w:sz w:val="22"/>
+          <w:szCs w:val="22"/>
+        </w:rPr>
+        <w:t xml:space="preserve">3.10 Dokumenter uden ændringer</w:t>
       </w:r>
     </w:p>
     <w:p>
@@ -7050,7 +7143,7 @@
           <w:sz w:val="18"/>
           <w:szCs w:val="18"/>
         </w:rPr>
-        <w:t xml:space="preserve">Bilag 02, 03, 3A Appendiks B/C/D/E, 3B, 04, 05, 06, 08, 09, 10, 11, 13, 15, 16, 17, Tilbudsbrev, Udbudsbetingelsernes bilag A og B samt erklæringerne. Bilag 09 (Ændringshåndtering) er bevidst urørt, da Optionen ikke er en ændring eller bestillingsydelse. "Optionel" i Appendiks C og D er et teknisk udtryk for valgfrie datafelter og er ikke berørt.</w:t>
+        <w:t xml:space="preserve">Bilag 02, 03, 3A Appendiks B/C/D/E, 3B, 04, 05, 06, 08, 10, 11, 13, 15, 16, 17, Tilbudsbrev, Udbudsbetingelsernes bilag A og B samt erklæringerne. Bilag 09 er kun rettet i henvisningerne, da Optionen ikke er en ændring eller bestillingsydelse. "Optionel" i Appendiks C og D er et teknisk udtryk for valgfrie datafelter og er ikke berørt.</w:t>
       </w:r>
     </w:p>
     <w:p>
@@ -7066,7 +7159,7 @@
           <w:sz w:val="26"/>
           <w:szCs w:val="26"/>
         </w:rPr>
-        <w:t xml:space="preserve">4. Forhold til Maj-Britts version af Kontrakten</w:t>
+        <w:t xml:space="preserve">4. Sammenhæng mellem Kontrakten og bilagene</w:t>
       </w:r>
     </w:p>
     <w:p>
@@ -7079,7 +7172,20 @@
           <w:sz w:val="18"/>
           <w:szCs w:val="18"/>
         </w:rPr>
-        <w:t xml:space="preserve">Maj-Britts sporede ændringer ligger i den lokale Kontrakt-fil og ikke i repoet. Strukturen i denne version er lagt tæt op ad hendes: samme definition, samme steder i 3.1 og 5.3.1, de to overskrifter i kapitel 6 og en vederlagsbestemmelse i kapitel 15. To forhold, som notatet flagger hos hende, er lukket her: krydshenvisningerne til punkt 6.2.2 er rettet, og løftet om vederlag i bilag 12 er indfriet med bilag 12 punkt 8 og Appendiks A blok 8. Vælges hendes Kontrakt, skal disse to ting rettes dér, og henvisningen "punkt 15.8" i bilag 12, Udbudsbetingelser og bilag 3A skal tilpasses hendes punktnummer.</w:t>
+        <w:t xml:space="preserve">Kontraktens definition henviser til "bilag 3" (Leverancebeskrivelsen), som omfatter bilag 3A, hvor Optionens krav står i afsnit 2.1, 2.3 og 3.5. Kontraktens punkt 15.3 henviser til bilag 12, hvor punkt 8 og Appendiks A blok 8 fastsætter vederlaget. Kontraktens punkt 6.2 (del af Leverancen) svarer til bilag 12 punkt 4 (vederlaget lægges til Leverancevederlaget) og bilag 01 afsnit 2.2 (afklaring i afklaringsfasen). Kontraktens punkt 6.3 (Selvstændig Opgave) svarer til bilag 12 punkt 10 (fakturering ved godkendt overtagelsesprøve) og bilag 14 punkt 1 (prøveforløb).</w:t>
+      </w:r>
+    </w:p>
+    <w:p>
+      <w:pPr>
+        <w:spacing w:after="120"/>
+      </w:pPr>
+      <w:r>
+        <w:rPr>
+          <w:rFonts w:ascii="Verdana" w:cs="Verdana" w:eastAsia="Verdana" w:hAnsi="Verdana"/>
+          <w:sz w:val="18"/>
+          <w:szCs w:val="18"/>
+        </w:rPr>
+        <w:t xml:space="preserve">Sporede ændringer med forfatter "Claude" er de tilføjelser, der ligger oven på Maj-Britts. Mit tidligere, selvstændige Kontrakt-udkast er trukket tilbage.</w:t>
       </w:r>
     </w:p>
     <w:p>
@@ -7113,7 +7219,7 @@
           <w:sz w:val="18"/>
           <w:szCs w:val="18"/>
         </w:rPr>
-        <w:t xml:space="preserve">Skæringspunkt for levering som del af Leverancen: her sat til "senest ved afklaringsfasens afslutning". Alternativ: ved kontraktunderskrift.</w:t>
+        <w:t xml:space="preserve">Kontraktens punkt 5.3.1 forudsætter bestilling "i forbindelse med kontraktunderskrivelsen", mens punkt 6.2 alene kræver Meddelelse. Overvej at fastsætte et seneste tidspunkt for bestilling som del af Leverancen (fx afklaringsfasens afslutning), så tidsplanen i bilag 1 kan holde.</w:t>
       </w:r>
     </w:p>
     <w:p>
@@ -7167,7 +7273,7 @@
           <w:sz w:val="18"/>
           <w:szCs w:val="18"/>
         </w:rPr>
-        <w:t xml:space="preserve">Indholdsfortegnelserne i Kontrakt, bilag 3A og bilag 12 skal opdateres i Word efter accept af ændringerne.</w:t>
+        <w:t xml:space="preserve">Indholdsfortegnelser og krydshenvisningsfelter i Kontrakt, bilag 3A og bilag 12 skal opdateres i Word (Ctrl+A, F9) efter accept af ændringerne.</w:t>
       </w:r>
     </w:p>
     <w:sectPr>

</xml_diff>

<commit_message>
DVR: tilføj Appendiks C til ændringsoversigten
Nyt afsnit 3.3 om den rammesættende sætning i Bilag 3A Appendiks C
(Brugerflade til DVR online). Efterfølgende afsnit renummereret.

Co-Authored-By: Claude Fable 5.1 <noreply@anthropic.com>
Claude-Session: https://claude.ai/code/session_011976vgLmukizxh8qCBktF4
</commit_message>
<xml_diff>
--- a/Stjernekort/testdata/dvr/Ændringsoversigt - Option DVR online.docx
+++ b/Stjernekort/testdata/dvr/Ændringsoversigt - Option DVR online.docx
@@ -27,7 +27,7 @@
           <w:sz w:val="18"/>
           <w:szCs w:val="18"/>
         </w:rPr>
-        <w:t xml:space="preserve">Arbejdsnotat, 30. september 2026. Udarbejdet med Claude Code. Alle ændringer i Word-dokumenterne er indsat som sporede ændringer (forfatter "Claude"), så de kan accepteres eller afvises enkeltvis. Ændringer i de to Excel-ark er indsat direkte.</w:t>
+        <w:t xml:space="preserve">Arbejdsnotat, 30. september 2026 (opdateret med Appendiks C). Udarbejdet med Claude Code. Alle ændringer i Word-dokumenterne er indsat som sporede ændringer (forfatter "Claude"), så de kan accepteres eller afvises enkeltvis. Ændringer i de to Excel-ark er indsat direkte.</w:t>
       </w:r>
     </w:p>
     <w:p>
@@ -4598,7 +4598,256 @@
           <w:sz w:val="22"/>
           <w:szCs w:val="22"/>
         </w:rPr>
-        <w:t xml:space="preserve">3.3 Bilag 3B Appendiks B Kravmatrix (15., Excel)</w:t>
+        <w:t xml:space="preserve">3.3 Bilag 3A Appendiks C Brugerflade til DVR online (11.)</w:t>
+      </w:r>
+    </w:p>
+    <w:tbl>
+      <w:tblPr>
+        <w:tblW w:type="dxa" w:w="9000"/>
+        <w:tblBorders>
+          <w:top w:val="single" w:color="auto" w:sz="4"/>
+          <w:left w:val="single" w:color="auto" w:sz="4"/>
+          <w:bottom w:val="single" w:color="auto" w:sz="4"/>
+          <w:right w:val="single" w:color="auto" w:sz="4"/>
+          <w:insideH w:val="single" w:color="auto" w:sz="4"/>
+          <w:insideV w:val="single" w:color="auto" w:sz="4"/>
+        </w:tblBorders>
+      </w:tblPr>
+      <w:tblGrid>
+        <w:gridCol w:w="1900"/>
+        <w:gridCol w:w="3500"/>
+        <w:gridCol w:w="3600"/>
+      </w:tblGrid>
+      <w:tr>
+        <w:trPr>
+          <w:tblHeader/>
+        </w:trPr>
+        <w:tc>
+          <w:tcPr>
+            <w:tcW w:type="dxa" w:w="1900"/>
+            <w:tcBorders>
+              <w:top w:val="single" w:color="999999" w:sz="4"/>
+              <w:left w:val="single" w:color="999999" w:sz="4"/>
+              <w:bottom w:val="single" w:color="999999" w:sz="4"/>
+              <w:right w:val="single" w:color="999999" w:sz="4"/>
+            </w:tcBorders>
+            <w:shd w:fill="D9E2F3" w:color="auto" w:val="clear"/>
+            <w:tcMar>
+              <w:top w:type="dxa" w:w="60"/>
+              <w:left w:type="dxa" w:w="80"/>
+              <w:bottom w:type="dxa" w:w="60"/>
+              <w:right w:type="dxa" w:w="80"/>
+            </w:tcMar>
+          </w:tcPr>
+          <w:p>
+            <w:pPr>
+              <w:spacing w:after="40"/>
+            </w:pPr>
+            <w:r>
+              <w:rPr>
+                <w:rFonts w:ascii="Verdana" w:cs="Verdana" w:eastAsia="Verdana" w:hAnsi="Verdana"/>
+                <w:b/>
+                <w:bCs/>
+                <w:sz w:val="18"/>
+                <w:szCs w:val="18"/>
+              </w:rPr>
+              <w:t xml:space="preserve">Sted</w:t>
+            </w:r>
+          </w:p>
+        </w:tc>
+        <w:tc>
+          <w:tcPr>
+            <w:tcW w:type="dxa" w:w="3500"/>
+            <w:tcBorders>
+              <w:top w:val="single" w:color="999999" w:sz="4"/>
+              <w:left w:val="single" w:color="999999" w:sz="4"/>
+              <w:bottom w:val="single" w:color="999999" w:sz="4"/>
+              <w:right w:val="single" w:color="999999" w:sz="4"/>
+            </w:tcBorders>
+            <w:shd w:fill="D9E2F3" w:color="auto" w:val="clear"/>
+            <w:tcMar>
+              <w:top w:type="dxa" w:w="60"/>
+              <w:left w:type="dxa" w:w="80"/>
+              <w:bottom w:type="dxa" w:w="60"/>
+              <w:right w:type="dxa" w:w="80"/>
+            </w:tcMar>
+          </w:tcPr>
+          <w:p>
+            <w:pPr>
+              <w:spacing w:after="40"/>
+            </w:pPr>
+            <w:r>
+              <w:rPr>
+                <w:rFonts w:ascii="Verdana" w:cs="Verdana" w:eastAsia="Verdana" w:hAnsi="Verdana"/>
+                <w:b/>
+                <w:bCs/>
+                <w:sz w:val="18"/>
+                <w:szCs w:val="18"/>
+              </w:rPr>
+              <w:t xml:space="preserve">Oprindelig ordlyd</w:t>
+            </w:r>
+          </w:p>
+        </w:tc>
+        <w:tc>
+          <w:tcPr>
+            <w:tcW w:type="dxa" w:w="3600"/>
+            <w:tcBorders>
+              <w:top w:val="single" w:color="999999" w:sz="4"/>
+              <w:left w:val="single" w:color="999999" w:sz="4"/>
+              <w:bottom w:val="single" w:color="999999" w:sz="4"/>
+              <w:right w:val="single" w:color="999999" w:sz="4"/>
+            </w:tcBorders>
+            <w:shd w:fill="D9E2F3" w:color="auto" w:val="clear"/>
+            <w:tcMar>
+              <w:top w:type="dxa" w:w="60"/>
+              <w:left w:type="dxa" w:w="80"/>
+              <w:bottom w:type="dxa" w:w="60"/>
+              <w:right w:type="dxa" w:w="80"/>
+            </w:tcMar>
+          </w:tcPr>
+          <w:p>
+            <w:pPr>
+              <w:spacing w:after="40"/>
+            </w:pPr>
+            <w:r>
+              <w:rPr>
+                <w:rFonts w:ascii="Verdana" w:cs="Verdana" w:eastAsia="Verdana" w:hAnsi="Verdana"/>
+                <w:b/>
+                <w:bCs/>
+                <w:sz w:val="18"/>
+                <w:szCs w:val="18"/>
+              </w:rPr>
+              <w:t xml:space="preserve">Ny ordlyd</w:t>
+            </w:r>
+          </w:p>
+        </w:tc>
+      </w:tr>
+      <w:tr>
+        <w:tc>
+          <w:tcPr>
+            <w:tcW w:type="dxa" w:w="1900"/>
+            <w:tcBorders>
+              <w:top w:val="single" w:color="999999" w:sz="4"/>
+              <w:left w:val="single" w:color="999999" w:sz="4"/>
+              <w:bottom w:val="single" w:color="999999" w:sz="4"/>
+              <w:right w:val="single" w:color="999999" w:sz="4"/>
+            </w:tcBorders>
+            <w:tcMar>
+              <w:top w:type="dxa" w:w="60"/>
+              <w:left w:type="dxa" w:w="80"/>
+              <w:bottom w:type="dxa" w:w="60"/>
+              <w:right w:type="dxa" w:w="80"/>
+            </w:tcMar>
+          </w:tcPr>
+          <w:p>
+            <w:pPr>
+              <w:spacing w:after="40"/>
+            </w:pPr>
+            <w:r>
+              <w:rPr>
+                <w:rFonts w:ascii="Verdana" w:cs="Verdana" w:eastAsia="Verdana" w:hAnsi="Verdana"/>
+                <w:b w:val="false"/>
+                <w:bCs w:val="false"/>
+                <w:sz w:val="17"/>
+                <w:szCs w:val="17"/>
+              </w:rPr>
+              <w:t xml:space="preserve">Afsnit 1, nyt afsnit efter første afsnit</w:t>
+            </w:r>
+          </w:p>
+        </w:tc>
+        <w:tc>
+          <w:tcPr>
+            <w:tcW w:type="dxa" w:w="3500"/>
+            <w:tcBorders>
+              <w:top w:val="single" w:color="999999" w:sz="4"/>
+              <w:left w:val="single" w:color="999999" w:sz="4"/>
+              <w:bottom w:val="single" w:color="999999" w:sz="4"/>
+              <w:right w:val="single" w:color="999999" w:sz="4"/>
+            </w:tcBorders>
+            <w:tcMar>
+              <w:top w:type="dxa" w:w="60"/>
+              <w:left w:type="dxa" w:w="80"/>
+              <w:bottom w:type="dxa" w:w="60"/>
+              <w:right w:type="dxa" w:w="80"/>
+            </w:tcMar>
+          </w:tcPr>
+          <w:p>
+            <w:pPr>
+              <w:spacing w:after="40"/>
+            </w:pPr>
+            <w:r>
+              <w:rPr>
+                <w:rFonts w:ascii="Verdana" w:cs="Verdana" w:eastAsia="Verdana" w:hAnsi="Verdana"/>
+                <w:b w:val="false"/>
+                <w:bCs w:val="false"/>
+                <w:sz w:val="17"/>
+                <w:szCs w:val="17"/>
+              </w:rPr>
+              <w:t xml:space="preserve">(ny)</w:t>
+            </w:r>
+          </w:p>
+        </w:tc>
+        <w:tc>
+          <w:tcPr>
+            <w:tcW w:type="dxa" w:w="3600"/>
+            <w:tcBorders>
+              <w:top w:val="single" w:color="999999" w:sz="4"/>
+              <w:left w:val="single" w:color="999999" w:sz="4"/>
+              <w:bottom w:val="single" w:color="999999" w:sz="4"/>
+              <w:right w:val="single" w:color="999999" w:sz="4"/>
+            </w:tcBorders>
+            <w:tcMar>
+              <w:top w:type="dxa" w:w="60"/>
+              <w:left w:type="dxa" w:w="80"/>
+              <w:bottom w:type="dxa" w:w="60"/>
+              <w:right w:type="dxa" w:w="80"/>
+            </w:tcMar>
+          </w:tcPr>
+          <w:p>
+            <w:pPr>
+              <w:spacing w:after="40"/>
+            </w:pPr>
+            <w:r>
+              <w:rPr>
+                <w:rFonts w:ascii="Verdana" w:cs="Verdana" w:eastAsia="Verdana" w:hAnsi="Verdana"/>
+                <w:b w:val="false"/>
+                <w:bCs w:val="false"/>
+                <w:sz w:val="17"/>
+                <w:szCs w:val="17"/>
+              </w:rPr>
+              <w:t xml:space="preserve">"Dette appendiks beskriver brugerfladen for Optionen, jf. Kontraktens punkt 6.2 og 6.3, og understøtter kravene i bilag 3A, afsnit 2.1, 2.3 og 3.5. Vederlaget for Optionen fremgår af bilag 12, Appendiks A, punkt 8."</w:t>
+            </w:r>
+          </w:p>
+        </w:tc>
+      </w:tr>
+    </w:tbl>
+    <w:p>
+      <w:pPr>
+        <w:spacing w:after="120" w:before="120"/>
+      </w:pPr>
+      <w:r>
+        <w:rPr>
+          <w:rFonts w:ascii="Verdana" w:cs="Verdana" w:eastAsia="Verdana" w:hAnsi="Verdana"/>
+          <w:sz w:val="18"/>
+          <w:szCs w:val="18"/>
+        </w:rPr>
+        <w:t xml:space="preserve">"Optionelt" i appendiksets tabeller er uændret. Det betegner valgfrie datafelter i brugerfladen og har intet med Optionen at gøre.</w:t>
+      </w:r>
+    </w:p>
+    <w:p>
+      <w:pPr>
+        <w:pStyle w:val="Heading2"/>
+        <w:spacing w:after="120" w:before="240"/>
+      </w:pPr>
+      <w:r>
+        <w:rPr>
+          <w:rFonts w:ascii="Verdana" w:cs="Verdana" w:eastAsia="Verdana" w:hAnsi="Verdana"/>
+          <w:b/>
+          <w:bCs/>
+          <w:sz w:val="22"/>
+          <w:szCs w:val="22"/>
+        </w:rPr>
+        <w:t xml:space="preserve">3.4 Bilag 3B Appendiks B Kravmatrix (15., Excel)</w:t>
       </w:r>
     </w:p>
     <w:p>
@@ -4627,7 +4876,7 @@
           <w:sz w:val="22"/>
           <w:szCs w:val="22"/>
         </w:rPr>
-        <w:t xml:space="preserve">3.4 Bilag 12 Leverancevederlag og betalingsplan samt øvrige priser (23.)</w:t>
+        <w:t xml:space="preserve">3.5 Bilag 12 Leverancevederlag og betalingsplan samt øvrige priser (23.)</w:t>
       </w:r>
     </w:p>
     <w:p>
@@ -5313,7 +5562,7 @@
           <w:sz w:val="22"/>
           <w:szCs w:val="22"/>
         </w:rPr>
-        <w:t xml:space="preserve">3.5 Bilag 12 Appendiks A Prisskema (24., Excel)</w:t>
+        <w:t xml:space="preserve">3.6 Bilag 12 Appendiks A Prisskema (24., Excel)</w:t>
       </w:r>
     </w:p>
     <w:tbl>
@@ -5892,7 +6141,7 @@
           <w:sz w:val="22"/>
           <w:szCs w:val="22"/>
         </w:rPr>
-        <w:t xml:space="preserve">3.6 Udbudsbetingelser (01.)</w:t>
+        <w:t xml:space="preserve">3.7 Udbudsbetingelser (01.)</w:t>
       </w:r>
     </w:p>
     <w:tbl>
@@ -6324,7 +6573,7 @@
           <w:sz w:val="22"/>
           <w:szCs w:val="22"/>
         </w:rPr>
-        <w:t xml:space="preserve">3.7 Bilag 01 Tidsplan (06.)</w:t>
+        <w:t xml:space="preserve">3.8 Bilag 01 Tidsplan (06.)</w:t>
       </w:r>
     </w:p>
     <w:tbl>
@@ -6658,7 +6907,7 @@
           <w:sz w:val="22"/>
           <w:szCs w:val="22"/>
         </w:rPr>
-        <w:t xml:space="preserve">3.8 Bilag 14 Prøver (26.)</w:t>
+        <w:t xml:space="preserve">3.9 Bilag 14 Prøver (26.)</w:t>
       </w:r>
     </w:p>
     <w:tbl>
@@ -6894,7 +7143,7 @@
           <w:sz w:val="22"/>
           <w:szCs w:val="22"/>
         </w:rPr>
-        <w:t xml:space="preserve">3.9 Bilag 09 Ændringshåndtering (20.)</w:t>
+        <w:t xml:space="preserve">3.10 Bilag 09 Ændringshåndtering (20.)</w:t>
       </w:r>
     </w:p>
     <w:tbl>
@@ -7130,7 +7379,7 @@
           <w:sz w:val="22"/>
           <w:szCs w:val="22"/>
         </w:rPr>
-        <w:t xml:space="preserve">3.10 Dokumenter uden ændringer</w:t>
+        <w:t xml:space="preserve">3.11 Dokumenter uden ændringer</w:t>
       </w:r>
     </w:p>
     <w:p>
@@ -7143,7 +7392,7 @@
           <w:sz w:val="18"/>
           <w:szCs w:val="18"/>
         </w:rPr>
-        <w:t xml:space="preserve">Bilag 02, 03, 3A Appendiks B/C/D/E, 3B, 04, 05, 06, 08, 10, 11, 13, 15, 16, 17, Tilbudsbrev, Udbudsbetingelsernes bilag A og B samt erklæringerne. Bilag 09 er kun rettet i henvisningerne, da Optionen ikke er en ændring eller bestillingsydelse. "Optionel" i Appendiks C og D er et teknisk udtryk for valgfrie datafelter og er ikke berørt.</w:t>
+        <w:t xml:space="preserve">Bilag 02, 03, 3A Appendiks B/D/E, 3B, 04, 05, 06, 08, 10, 11, 13, 15, 16, 17, Tilbudsbrev, Udbudsbetingelsernes bilag A og B samt erklæringerne. Bilag 09 er kun rettet i henvisningerne, da Optionen ikke er en ændring eller bestillingsydelse. "Optionel" i Appendiks C og D er et teknisk udtryk for valgfrie datafelter og er ikke berørt.</w:t>
       </w:r>
     </w:p>
     <w:p>

</xml_diff>

<commit_message>
DVR: opdater Ændringsoversigtens afsnit 3.2 og 3.10 (Bilag 3A og Appendiks C er nu ændret)
</commit_message>
<xml_diff>
--- a/Stjernekort/testdata/dvr/Ændringsoversigt - Option DVR online.docx
+++ b/Stjernekort/testdata/dvr/Ændringsoversigt - Option DVR online.docx
@@ -4582,7 +4582,7 @@
           <w:sz w:val="18"/>
           <w:szCs w:val="18"/>
         </w:rPr>
-        <w:t xml:space="preserve">Ikke ændret, men bør gennemses: "DVR online" nævnes i forbifarten i generelle krav i afsnit 3.1, 3.2.5, 3.4, 4 og 5.1 (fejlbeskeder, servicekald, rapportering, realtidskommunikation, logning). Disse krav gælder Løsningen som helhed og er ladt urørt.</w:t>
+        <w:t>Ændret: Krav-linjerne i afsnit 2.1 (1 linje), 2.3 (1 linje) og 3.5 (14 linjer, samt en ny rammesættende sætning før den første kravtabel i afsnit 3.5) er omformuleret til “Det er et krav, at Optionen omfatter, at ...”. Bilag 3A Appendiks C (11., brugerfladen for DVR online) har fået en tilsvarende rammesættende sætning i afsnit 1, efter første afsnit: “Dette appendiks beskriver brugerfladen for Optionen, jf. Kontraktens punkt 6.2 og 6.3, og understøtter kravene i bilag 3A, afsnit 2.1, 2.3 og 3.5. Vederlaget for Optionen fremgår af bilag 12, Appendiks A, punkt 8.” Generelle krav i afsnit 3.1, 3.2.5, 3.4, 4 og 5.1 (fejlbeskeder, servicekald, rapportering, realtidskommunikation, logning) gælder Løsningen som helhed og er ladt urørt, da de ikke er specifikke for Optionen.</w:t>
       </w:r>
     </w:p>
     <w:p>
@@ -7143,7 +7143,7 @@
           <w:sz w:val="18"/>
           <w:szCs w:val="18"/>
         </w:rPr>
-        <w:t xml:space="preserve">Bilag 02, 03, 3A Appendiks B/C/D/E, 3B, 04, 05, 06, 08, 10, 11, 13, 15, 16, 17, Tilbudsbrev, Udbudsbetingelsernes bilag A og B samt erklæringerne. Bilag 09 er kun rettet i henvisningerne, da Optionen ikke er en ændring eller bestillingsydelse. "Optionel" i Appendiks C og D er et teknisk udtryk for valgfrie datafelter og er ikke berørt.</w:t>
+        <w:t>Bilag 02, 03, 3A Appendiks B/D/E, 3B, 04, 05, 06, 08, 10, 11, 13, 15, 16, 17, Tilbudsbrev, Udbudsbetingelsernes bilag A og B samt erklæringerne. Bilag 09 er kun rettet i henvisningerne, da Optionen ikke er en ændring eller bestillingsydelse. Bilag 3A Appendiks C har fået én rammesættende sætning i afsnit 1 (se afsnit 3.2 ovenfor); i øvrigt uændret. “Optionel” i Appendiks C og D er et teknisk udtryk for valgfrie datafelter og er ikke berørt.</w:t>
       </w:r>
     </w:p>
     <w:p>

</xml_diff>